<commit_message>
Journey guides: re-shoot the screens changed by the UI fixes (G2)
Both guides (en + it) re-shot on staging, dark theme, 390x844: signup
controls and terms checkbox, Edit Service dialog, provider prices, dark
location map, provider bookings cards, "Welcome!" + Recent Activity,
search result cards, calendar with disabled days, booking detail badge,
My bookings chevron. Text updated, fixed items removed from the issues
tables, new findings added, both .docx rebuilt.

Co-Authored-By: Claude Opus 5.5 <noreply@anthropic.com>
</commit_message>
<xml_diff>
--- a/docs/user-journeys/signup-to-booking.docx
+++ b/docs/user-journeys/signup-to-booking.docx
@@ -177,7 +177,7 @@
                 <w:bCs/>
                 <w:b/>
               </w:rPr>
-              <w:t xml:space="preserve">Device</w:t>
+              <w:t xml:space="preserve">Updated</w:t>
             </w:r>
           </w:p>
         </w:tc>
@@ -188,8 +188,43 @@
               <w:jc w:val="left"/>
             </w:pPr>
             <w:r>
-              <w:t xml:space="preserve">Mobile viewport 390 × 844 (iPhone 12/13/14 size). Long screens are captured at full height</w:t>
-            </w:r>
+              <w:t xml:space="preserve">1 October 2026: the screens changed by the UI fixes were re-shot on the deployed staging app (</w:t>
+            </w:r>
+            <w:r>
+              <w:rPr>
+                <w:rStyle w:val="VerbatimChar"/>
+              </w:rPr>
+              <w:t xml:space="preserve">main</w:t>
+            </w:r>
+            <w:r>
+              <w:t xml:space="preserve"> </w:t>
+            </w:r>
+            <w:r>
+              <w:t xml:space="preserve">@</w:t>
+            </w:r>
+            <w:r>
+              <w:t xml:space="preserve"> </w:t>
+            </w:r>
+            <w:r>
+              <w:rPr>
+                <w:rStyle w:val="VerbatimChar"/>
+              </w:rPr>
+              <w:t xml:space="preserve">9a2fcae</w:t>
+            </w:r>
+            <w:r>
+              <w:t xml:space="preserve">), see</w:t>
+            </w:r>
+            <w:r>
+              <w:t xml:space="preserve"> </w:t>
+            </w:r>
+            <w:hyperlink w:anchor="re-shoot-on-1-october-2026">
+              <w:r>
+                <w:rPr>
+                  <w:rStyle w:val="Hyperlink"/>
+                </w:rPr>
+                <w:t xml:space="preserve">Re-shoot on 1 October 2026</w:t>
+              </w:r>
+            </w:hyperlink>
           </w:p>
         </w:tc>
       </w:tr>
@@ -205,7 +240,7 @@
                 <w:bCs/>
                 <w:b/>
               </w:rPr>
-              <w:t xml:space="preserve">Theme</w:t>
+              <w:t xml:space="preserve">Device</w:t>
             </w:r>
           </w:p>
         </w:tc>
@@ -216,7 +251,7 @@
               <w:jc w:val="left"/>
             </w:pPr>
             <w:r>
-              <w:t xml:space="preserve">Dark</w:t>
+              <w:t xml:space="preserve">Mobile viewport 390 × 844 (iPhone 12/13/14 size). Long screens are captured at full height</w:t>
             </w:r>
           </w:p>
         </w:tc>
@@ -233,7 +268,7 @@
                 <w:bCs/>
                 <w:b/>
               </w:rPr>
-              <w:t xml:space="preserve">Language</w:t>
+              <w:t xml:space="preserve">Theme</w:t>
             </w:r>
           </w:p>
         </w:tc>
@@ -244,7 +279,7 @@
               <w:jc w:val="left"/>
             </w:pPr>
             <w:r>
-              <w:t xml:space="preserve">English (the app also ships in Italian, Spanish, French and German)</w:t>
+              <w:t xml:space="preserve">Dark</w:t>
             </w:r>
           </w:p>
         </w:tc>
@@ -261,7 +296,7 @@
                 <w:bCs/>
                 <w:b/>
               </w:rPr>
-              <w:t xml:space="preserve">Provider used</w:t>
+              <w:t xml:space="preserve">Language</w:t>
             </w:r>
           </w:p>
         </w:tc>
@@ -272,16 +307,7 @@
               <w:jc w:val="left"/>
             </w:pPr>
             <w:r>
-              <w:t xml:space="preserve">Davide Moretti,</w:t>
-            </w:r>
-            <w:r>
-              <w:t xml:space="preserve"> </w:t>
-            </w:r>
-            <w:r>
-              <w:rPr>
-                <w:rStyle w:val="VerbatimChar"/>
-              </w:rPr>
-              <w:t xml:space="preserve">journey.en.provider@vitfitdemo.dev</w:t>
+              <w:t xml:space="preserve">English (the app also ships in Italian, Spanish, French and German)</w:t>
             </w:r>
           </w:p>
         </w:tc>
@@ -298,7 +324,7 @@
                 <w:bCs/>
                 <w:b/>
               </w:rPr>
-              <w:t xml:space="preserve">Customer used</w:t>
+              <w:t xml:space="preserve">Provider used</w:t>
             </w:r>
           </w:p>
         </w:tc>
@@ -309,7 +335,7 @@
               <w:jc w:val="left"/>
             </w:pPr>
             <w:r>
-              <w:t xml:space="preserve">Elena Gallo,</w:t>
+              <w:t xml:space="preserve">Davide Moretti,</w:t>
             </w:r>
             <w:r>
               <w:t xml:space="preserve"> </w:t>
@@ -318,7 +344,7 @@
               <w:rPr>
                 <w:rStyle w:val="VerbatimChar"/>
               </w:rPr>
-              <w:t xml:space="preserve">journey.en.customer@vitfitdemo.dev</w:t>
+              <w:t xml:space="preserve">journey.en.provider@vitfitdemo.dev</w:t>
             </w:r>
           </w:p>
         </w:tc>
@@ -335,7 +361,7 @@
                 <w:bCs/>
                 <w:b/>
               </w:rPr>
-              <w:t xml:space="preserve">Resulting booking</w:t>
+              <w:t xml:space="preserve">Customer used</w:t>
             </w:r>
           </w:p>
         </w:tc>
@@ -346,6 +372,43 @@
               <w:jc w:val="left"/>
             </w:pPr>
             <w:r>
+              <w:t xml:space="preserve">Elena Gallo,</w:t>
+            </w:r>
+            <w:r>
+              <w:t xml:space="preserve"> </w:t>
+            </w:r>
+            <w:r>
+              <w:rPr>
+                <w:rStyle w:val="VerbatimChar"/>
+              </w:rPr>
+              <w:t xml:space="preserve">journey.en.customer@vitfitdemo.dev</w:t>
+            </w:r>
+          </w:p>
+        </w:tc>
+      </w:tr>
+      <w:tr>
+        <w:tc>
+          <w:p>
+            <w:pPr>
+              <w:pStyle w:val="Compact"/>
+              <w:jc w:val="left"/>
+            </w:pPr>
+            <w:r>
+              <w:rPr>
+                <w:bCs/>
+                <w:b/>
+              </w:rPr>
+              <w:t xml:space="preserve">Resulting booking</w:t>
+            </w:r>
+          </w:p>
+        </w:tc>
+        <w:tc>
+          <w:p>
+            <w:pPr>
+              <w:pStyle w:val="Compact"/>
+              <w:jc w:val="left"/>
+            </w:pPr>
+            <w:r>
               <w:rPr>
                 <w:rStyle w:val="VerbatimChar"/>
               </w:rPr>
@@ -364,6 +427,49 @@
       </w:pPr>
       <w:r>
         <w:t xml:space="preserve">Both accounts were created fresh for this walkthrough. Nothing in it was seeded or mocked.</w:t>
+      </w:r>
+    </w:p>
+    <w:p>
+      <w:pPr>
+        <w:pStyle w:val="BlockText"/>
+      </w:pPr>
+      <w:r>
+        <w:rPr>
+          <w:bCs/>
+          <w:b/>
+        </w:rPr>
+        <w:t xml:space="preserve">About the 1 October re-shoot.</w:t>
+      </w:r>
+      <w:r>
+        <w:t xml:space="preserve"> </w:t>
+      </w:r>
+      <w:r>
+        <w:t xml:space="preserve">By then the Fri 2 Oct request had already been confirmed, so the screens that need an open request (B10–B13, A14–A15) were re-taken with a second request from the same customer to the same trainer:</w:t>
+      </w:r>
+      <w:r>
+        <w:t xml:space="preserve"> </w:t>
+      </w:r>
+      <w:r>
+        <w:rPr>
+          <w:bCs/>
+          <w:b/>
+        </w:rPr>
+        <w:t xml:space="preserve">Fri 9 Oct 2026, 10:00</w:t>
+      </w:r>
+      <w:r>
+        <w:t xml:space="preserve"> </w:t>
+      </w:r>
+      <w:r>
+        <w:t xml:space="preserve">(</w:t>
+      </w:r>
+      <w:r>
+        <w:rPr>
+          <w:rStyle w:val="VerbatimChar"/>
+        </w:rPr>
+        <w:t xml:space="preserve">zMF09KunKbRCmuyyTxiQ</w:t>
+      </w:r>
+      <w:r>
+        <w:t xml:space="preserve">), confirmed by the trainer and then cancelled by the customer. Those screenshots show Oct 9; the rest of the walkthrough is unchanged.</w:t>
       </w:r>
     </w:p>
     <w:p>
@@ -1131,7 +1237,23 @@
         <w:t xml:space="preserve">/auth/register?as=provider</w:t>
       </w:r>
       <w:r>
-        <w:t xml:space="preserve">. It goes straight to the email signup form, with the professional opt-in already ticked. The header has the language picker and the light / dark / system theme switch.</w:t>
+        <w:t xml:space="preserve">. It goes straight to the email signup form, with the professional opt-in already ticked. A row at the top holds the language picker and the light / dark / system theme switch; the</w:t>
+      </w:r>
+      <w:r>
+        <w:t xml:space="preserve"> </w:t>
+      </w:r>
+      <w:r>
+        <w:rPr>
+          <w:bCs/>
+          <w:b/>
+        </w:rPr>
+        <w:t xml:space="preserve">Back</w:t>
+      </w:r>
+      <w:r>
+        <w:t xml:space="preserve"> </w:t>
+      </w:r>
+      <w:r>
+        <w:t xml:space="preserve">link sits below it.</w:t>
       </w:r>
     </w:p>
     <w:p>
@@ -1446,7 +1568,7 @@
         <w:t xml:space="preserve">Functional Training</w:t>
       </w:r>
       <w:r>
-        <w:t xml:space="preserve">. They accept the Terms of Service and Privacy Policy and tap</w:t>
+        <w:t xml:space="preserve">. They tick the box to accept the Terms of Service and Privacy Policy (the ticked box is filled in the section colour, with the text right next to it) and tap</w:t>
       </w:r>
       <w:r>
         <w:t xml:space="preserve"> </w:t>
@@ -1865,6 +1987,83 @@
         <w:t xml:space="preserve">Provider dashboard on first login</w:t>
       </w:r>
     </w:p>
+    <w:p>
+      <w:pPr>
+        <w:pStyle w:val="BodyText"/>
+      </w:pPr>
+      <w:r>
+        <w:rPr>
+          <w:iCs/>
+          <w:i/>
+        </w:rPr>
+        <w:t xml:space="preserve">This screenshot is from 30 September and still shows the old greeting. A new provider is now greeted with</w:t>
+      </w:r>
+      <w:r>
+        <w:rPr>
+          <w:iCs/>
+          <w:i/>
+        </w:rPr>
+        <w:t xml:space="preserve"> </w:t>
+      </w:r>
+      <w:r>
+        <w:rPr>
+          <w:bCs/>
+          <w:b/>
+          <w:iCs/>
+          <w:i/>
+        </w:rPr>
+        <w:t xml:space="preserve">Welcome!</w:t>
+      </w:r>
+      <w:r>
+        <w:rPr>
+          <w:iCs/>
+          <w:i/>
+        </w:rPr>
+        <w:t xml:space="preserve"> </w:t>
+      </w:r>
+      <w:r>
+        <w:rPr>
+          <w:iCs/>
+          <w:i/>
+        </w:rPr>
+        <w:t xml:space="preserve">(</w:t>
+      </w:r>
+      <w:r>
+        <w:rPr>
+          <w:iCs/>
+          <w:i/>
+        </w:rPr>
+        <w:t xml:space="preserve">“</w:t>
+      </w:r>
+      <w:r>
+        <w:rPr>
+          <w:iCs/>
+          <w:i/>
+        </w:rPr>
+        <w:t xml:space="preserve">Welcome back!</w:t>
+      </w:r>
+      <w:r>
+        <w:rPr>
+          <w:iCs/>
+          <w:i/>
+        </w:rPr>
+        <w:t xml:space="preserve">”</w:t>
+      </w:r>
+      <w:r>
+        <w:rPr>
+          <w:iCs/>
+          <w:i/>
+        </w:rPr>
+        <w:t xml:space="preserve"> </w:t>
+      </w:r>
+      <w:r>
+        <w:rPr>
+          <w:iCs/>
+          <w:i/>
+        </w:rPr>
+        <w:t xml:space="preserve">only once they have delivered a session); see A16.</w:t>
+      </w:r>
+    </w:p>
     <w:bookmarkEnd w:id="33"/>
     <w:bookmarkStart w:id="35" w:name="Xae2d65bde46b50d6d2cb8edf23ae21638ac8a4c"/>
     <w:p>
@@ -1977,6 +2176,71 @@
         <w:t xml:space="preserve">Services list with two inactive drafts</w:t>
       </w:r>
     </w:p>
+    <w:p>
+      <w:pPr>
+        <w:pStyle w:val="BodyText"/>
+      </w:pPr>
+      <w:r>
+        <w:rPr>
+          <w:iCs/>
+          <w:i/>
+        </w:rPr>
+        <w:t xml:space="preserve">Screenshots A7 and A8 are from 30 September (the draft state can’t be recreated). Prices on the provider’s screens are now written out in full, e.g. </w:t>
+      </w:r>
+      <w:r>
+        <w:rPr>
+          <w:bCs/>
+          <w:b/>
+          <w:iCs/>
+          <w:i/>
+        </w:rPr>
+        <w:t xml:space="preserve">€0.00</w:t>
+      </w:r>
+      <w:r>
+        <w:rPr>
+          <w:iCs/>
+          <w:i/>
+        </w:rPr>
+        <w:t xml:space="preserve"> </w:t>
+      </w:r>
+      <w:r>
+        <w:rPr>
+          <w:iCs/>
+          <w:i/>
+        </w:rPr>
+        <w:t xml:space="preserve">and</w:t>
+      </w:r>
+      <w:r>
+        <w:rPr>
+          <w:iCs/>
+          <w:i/>
+        </w:rPr>
+        <w:t xml:space="preserve"> </w:t>
+      </w:r>
+      <w:r>
+        <w:rPr>
+          <w:bCs/>
+          <w:b/>
+          <w:iCs/>
+          <w:i/>
+        </w:rPr>
+        <w:t xml:space="preserve">€50.00</w:t>
+      </w:r>
+      <w:r>
+        <w:rPr>
+          <w:iCs/>
+          <w:i/>
+        </w:rPr>
+        <w:t xml:space="preserve"> </w:t>
+      </w:r>
+      <w:r>
+        <w:rPr>
+          <w:iCs/>
+          <w:i/>
+        </w:rPr>
+        <w:t xml:space="preserve">(see A10).</w:t>
+      </w:r>
+    </w:p>
     <w:bookmarkEnd w:id="35"/>
     <w:bookmarkStart w:id="37" w:name="a8.-open-the-service-actions"/>
     <w:p>
@@ -2271,7 +2535,39 @@
         <w:t xml:space="preserve">Save Changes</w:t>
       </w:r>
       <w:r>
-        <w:t xml:space="preserve">.</w:t>
+        <w:t xml:space="preserve">. The dialog is centred on the phone;</w:t>
+      </w:r>
+      <w:r>
+        <w:t xml:space="preserve"> </w:t>
+      </w:r>
+      <w:r>
+        <w:rPr>
+          <w:bCs/>
+          <w:b/>
+        </w:rPr>
+        <w:t xml:space="preserve">Esc</w:t>
+      </w:r>
+      <w:r>
+        <w:t xml:space="preserve"> </w:t>
+      </w:r>
+      <w:r>
+        <w:t xml:space="preserve">or</w:t>
+      </w:r>
+      <w:r>
+        <w:t xml:space="preserve"> </w:t>
+      </w:r>
+      <w:r>
+        <w:rPr>
+          <w:bCs/>
+          <w:b/>
+        </w:rPr>
+        <w:t xml:space="preserve">Cancel</w:t>
+      </w:r>
+      <w:r>
+        <w:t xml:space="preserve"> </w:t>
+      </w:r>
+      <w:r>
+        <w:t xml:space="preserve">closes it without saving.</w:t>
       </w:r>
       <w:r>
         <w:t xml:space="preserve"> </w:t>
@@ -2383,7 +2679,7 @@
           <w:bCs/>
           <w:b/>
         </w:rPr>
-        <w:t xml:space="preserve">€50 / 60 min</w:t>
+        <w:t xml:space="preserve">€50.00 / 60 min</w:t>
       </w:r>
       <w:r>
         <w:t xml:space="preserve"> </w:t>
@@ -2792,7 +3088,7 @@
         <w:t xml:space="preserve"> </w:t>
       </w:r>
       <w:r>
-        <w:t xml:space="preserve">Only an approximate position (~100 m) is stored.</w:t>
+        <w:t xml:space="preserve">Only an approximate position (~100 m) is stored. The map follows the app theme: dark here, light in the light theme.</w:t>
       </w:r>
     </w:p>
     <w:p>
@@ -3055,7 +3351,7 @@
         <w:t xml:space="preserve"> </w:t>
       </w:r>
       <w:r>
-        <w:t xml:space="preserve">shows each booking as a card on a phone: client name and email, status</w:t>
+        <w:t xml:space="preserve">shows each booking as a card on a phone: client avatar, name and email, status</w:t>
       </w:r>
       <w:r>
         <w:t xml:space="preserve"> </w:t>
@@ -3068,7 +3364,10 @@
         <w:t xml:space="preserve">AWAITING CONFIRMATION</w:t>
       </w:r>
       <w:r>
-        <w:t xml:space="preserve">, service and duration, date, time and price, with the</w:t>
+        <w:t xml:space="preserve"> </w:t>
+      </w:r>
+      <w:r>
+        <w:t xml:space="preserve">(under the name on a phone), service and duration, date, time and price, with the</w:t>
       </w:r>
       <w:r>
         <w:t xml:space="preserve"> </w:t>
@@ -3130,6 +3429,18 @@
       </w:r>
       <w:r>
         <w:t xml:space="preserve">.</w:t>
+      </w:r>
+    </w:p>
+    <w:p>
+      <w:pPr>
+        <w:pStyle w:val="BodyText"/>
+      </w:pPr>
+      <w:r>
+        <w:rPr>
+          <w:iCs/>
+          <w:i/>
+        </w:rPr>
+        <w:t xml:space="preserve">(Re-shot with the Oct 9 request; the confirmed Oct 2 booking is the card below it.)</w:t>
       </w:r>
     </w:p>
     <w:p>
@@ -3347,7 +3658,20 @@
         <w:pStyle w:val="FirstParagraph"/>
       </w:pPr>
       <w:r>
-        <w:t xml:space="preserve">The dashboard now counts</w:t>
+        <w:t xml:space="preserve">The greeting reads</w:t>
+      </w:r>
+      <w:r>
+        <w:t xml:space="preserve"> </w:t>
+      </w:r>
+      <w:r>
+        <w:rPr>
+          <w:bCs/>
+          <w:b/>
+        </w:rPr>
+        <w:t xml:space="preserve">Welcome!</w:t>
+      </w:r>
+      <w:r>
+        <w:t xml:space="preserve">, since the provider has not delivered a session yet. The dashboard counts</w:t>
       </w:r>
       <w:r>
         <w:t xml:space="preserve"> </w:t>
@@ -3423,6 +3747,67 @@
       <w:r>
         <w:t xml:space="preserve">button.</w:t>
       </w:r>
+      <w:r>
+        <w:t xml:space="preserve"> </w:t>
+      </w:r>
+      <w:r>
+        <w:rPr>
+          <w:iCs/>
+          <w:i/>
+        </w:rPr>
+        <w:t xml:space="preserve">Recent Activity</w:t>
+      </w:r>
+      <w:r>
+        <w:t xml:space="preserve"> </w:t>
+      </w:r>
+      <w:r>
+        <w:t xml:space="preserve">lists</w:t>
+      </w:r>
+      <w:r>
+        <w:t xml:space="preserve"> </w:t>
+      </w:r>
+      <w:r>
+        <w:rPr>
+          <w:bCs/>
+          <w:b/>
+        </w:rPr>
+        <w:t xml:space="preserve">Booking confirmed</w:t>
+      </w:r>
+      <w:r>
+        <w:t xml:space="preserve"> </w:t>
+      </w:r>
+      <w:r>
+        <w:t xml:space="preserve">and</w:t>
+      </w:r>
+      <w:r>
+        <w:t xml:space="preserve"> </w:t>
+      </w:r>
+      <w:r>
+        <w:rPr>
+          <w:bCs/>
+          <w:b/>
+        </w:rPr>
+        <w:t xml:space="preserve">New booking request</w:t>
+      </w:r>
+      <w:r>
+        <w:t xml:space="preserve"> </w:t>
+      </w:r>
+      <w:r>
+        <w:t xml:space="preserve">for</w:t>
+      </w:r>
+      <w:r>
+        <w:t xml:space="preserve"> </w:t>
+      </w:r>
+      <w:r>
+        <w:rPr>
+          <w:iCs/>
+          <w:i/>
+        </w:rPr>
+        <w:t xml:space="preserve">Elena Gallo · Personal Training</w:t>
+      </w:r>
+      <w:r>
+        <w:t xml:space="preserve">, newest first; each entry opens the booking.</w:t>
+      </w:r>
     </w:p>
     <w:p>
       <w:pPr>
@@ -3431,7 +3816,7 @@
       <w:r>
         <w:drawing>
           <wp:inline>
-            <wp:extent cx="1358490" cy="7199999"/>
+            <wp:extent cx="1366423" cy="7199999"/>
             <wp:effectExtent b="0" l="0" r="0" t="0"/>
             <wp:docPr descr="Dashboard with the upcoming appointment" title="" id="1" name="Picture"/>
             <a:graphic>
@@ -3452,7 +3837,7 @@
                   <pic:spPr bwMode="auto">
                     <a:xfrm>
                       <a:off x="0" y="0"/>
-                      <a:ext cx="1358490" cy="7199999"/>
+                      <a:ext cx="1366423" cy="7199999"/>
                     </a:xfrm>
                     <a:prstGeom prst="rect">
                       <a:avLst/>
@@ -3834,7 +4219,7 @@
       <w:r>
         <w:drawing>
           <wp:inline>
-            <wp:extent cx="2301639" cy="7199999"/>
+            <wp:extent cx="2244604" cy="7199999"/>
             <wp:effectExtent b="0" l="0" r="0" t="0"/>
             <wp:docPr descr="Customer signup form filled in" title="" id="1" name="Picture"/>
             <a:graphic>
@@ -3855,7 +4240,7 @@
                   <pic:spPr bwMode="auto">
                     <a:xfrm>
                       <a:off x="0" y="0"/>
-                      <a:ext cx="2301639" cy="7199999"/>
+                      <a:ext cx="2244604" cy="7199999"/>
                     </a:xfrm>
                     <a:prstGeom prst="rect">
                       <a:avLst/>
@@ -4347,10 +4732,36 @@
         <w:t xml:space="preserve"> </w:t>
       </w:r>
       <w:r>
-        <w:t xml:space="preserve">appears first,</w:t>
-      </w:r>
-      <w:r>
-        <w:t xml:space="preserve"> </w:t>
+        <w:t xml:space="preserve">appears first, marked</w:t>
+      </w:r>
+      <w:r>
+        <w:t xml:space="preserve"> </w:t>
+      </w:r>
+      <w:r>
+        <w:rPr>
+          <w:bCs/>
+          <w:b/>
+        </w:rPr>
+        <w:t xml:space="preserve">VERIFIED</w:t>
+      </w:r>
+      <w:r>
+        <w:t xml:space="preserve">,</w:t>
+      </w:r>
+      <w:r>
+        <w:t xml:space="preserve"> </w:t>
+      </w:r>
+      <w:r>
+        <w:rPr>
+          <w:bCs/>
+          <w:b/>
+        </w:rPr>
+        <w:t xml:space="preserve">From 50,00 €</w:t>
+      </w:r>
+      <w:r>
+        <w:t xml:space="preserve"> </w:t>
+      </w:r>
+      <w:r>
+        <w:t xml:space="preserve">with the distance (</w:t>
       </w:r>
       <w:r>
         <w:rPr>
@@ -4360,36 +4771,7 @@
         <w:t xml:space="preserve">0.1 km</w:t>
       </w:r>
       <w:r>
-        <w:t xml:space="preserve"> </w:t>
-      </w:r>
-      <w:r>
-        <w:t xml:space="preserve">away, marked</w:t>
-      </w:r>
-      <w:r>
-        <w:t xml:space="preserve"> </w:t>
-      </w:r>
-      <w:r>
-        <w:rPr>
-          <w:bCs/>
-          <w:b/>
-        </w:rPr>
-        <w:t xml:space="preserve">VERIFIED</w:t>
-      </w:r>
-      <w:r>
-        <w:t xml:space="preserve">,</w:t>
-      </w:r>
-      <w:r>
-        <w:t xml:space="preserve"> </w:t>
-      </w:r>
-      <w:r>
-        <w:rPr>
-          <w:bCs/>
-          <w:b/>
-        </w:rPr>
-        <w:t xml:space="preserve">From 50,00 €</w:t>
-      </w:r>
-      <w:r>
-        <w:t xml:space="preserve">. (A seeded trainer with the same name shows up further down, 1.3 km away.) They tap</w:t>
+        <w:t xml:space="preserve">) next to the price. (A seeded trainer with the same name shows up further down, 1.3 km away.) They tap</w:t>
       </w:r>
       <w:r>
         <w:t xml:space="preserve"> </w:t>
@@ -4679,23 +5061,7 @@
         <w:pStyle w:val="FirstParagraph"/>
       </w:pPr>
       <w:r>
-        <w:t xml:space="preserve">The calendar opens on the current month. The provider requires 24 h notice, so the customer moves to</w:t>
-      </w:r>
-      <w:r>
-        <w:t xml:space="preserve"> </w:t>
-      </w:r>
-      <w:r>
-        <w:rPr>
-          <w:bCs/>
-          <w:b/>
-        </w:rPr>
-        <w:t xml:space="preserve">October</w:t>
-      </w:r>
-      <w:r>
-        <w:t xml:space="preserve"> </w:t>
-      </w:r>
-      <w:r>
-        <w:t xml:space="preserve">with the › arrow and taps</w:t>
+        <w:t xml:space="preserve">The calendar opens on the current month and the customer taps</w:t>
       </w:r>
       <w:r>
         <w:t xml:space="preserve"> </w:t>
@@ -4708,34 +5074,23 @@
         <w:t xml:space="preserve">Friday 2</w:t>
       </w:r>
       <w:r>
-        <w:t xml:space="preserve">. Days are not greyed out by availability: a day without free slots (a weekend, or tomorrow once the notice period rules it out) opens with</w:t>
-      </w:r>
-      <w:r>
-        <w:t xml:space="preserve"> </w:t>
-      </w:r>
-      <w:r>
-        <w:rPr>
-          <w:iCs/>
-          <w:i/>
-        </w:rPr>
-        <w:t xml:space="preserve">“</w:t>
-      </w:r>
-      <w:r>
-        <w:rPr>
-          <w:iCs/>
-          <w:i/>
-        </w:rPr>
-        <w:t xml:space="preserve">No times available</w:t>
-      </w:r>
-      <w:r>
-        <w:rPr>
-          <w:iCs/>
-          <w:i/>
-        </w:rPr>
-        <w:t xml:space="preserve">”</w:t>
-      </w:r>
-      <w:r>
-        <w:t xml:space="preserve">.</w:t>
+        <w:t xml:space="preserve"> </w:t>
+      </w:r>
+      <w:r>
+        <w:t xml:space="preserve">(in the re-shot screenshot,</w:t>
+      </w:r>
+      <w:r>
+        <w:t xml:space="preserve"> </w:t>
+      </w:r>
+      <w:r>
+        <w:rPr>
+          <w:bCs/>
+          <w:b/>
+        </w:rPr>
+        <w:t xml:space="preserve">Friday 9</w:t>
+      </w:r>
+      <w:r>
+        <w:t xml:space="preserve">). Only days with at least one free slot can be tapped: weekends, days off and days inside the provider’s 24 h notice period (here today, Thu 1) are greyed out. They pulse briefly while the calendar checks the month.</w:t>
       </w:r>
     </w:p>
     <w:p>
@@ -4876,7 +5231,23 @@
         <w:t xml:space="preserve">Personal Training · Fri, Oct 2 · 10:00</w:t>
       </w:r>
       <w:r>
-        <w:t xml:space="preserve">, and they tap</w:t>
+        <w:t xml:space="preserve"> </w:t>
+      </w:r>
+      <w:r>
+        <w:t xml:space="preserve">(</w:t>
+      </w:r>
+      <w:r>
+        <w:rPr>
+          <w:iCs/>
+          <w:i/>
+        </w:rPr>
+        <w:t xml:space="preserve">Fri, Oct 9</w:t>
+      </w:r>
+      <w:r>
+        <w:t xml:space="preserve"> </w:t>
+      </w:r>
+      <w:r>
+        <w:t xml:space="preserve">in the screenshot), and they tap</w:t>
       </w:r>
       <w:r>
         <w:t xml:space="preserve"> </w:t>
@@ -4983,7 +5354,7 @@
         <w:pStyle w:val="Compact"/>
       </w:pPr>
       <w:r>
-        <w:t xml:space="preserve">the trainer, service, date and time (Friday, October 2 · 10:00 · 60 min) and city (Milano)</w:t>
+        <w:t xml:space="preserve">the trainer, service, date and time (Friday, October 2 · 10:00 · 60 min; October 9 in the screenshot) and city (Milano)</w:t>
       </w:r>
     </w:p>
     <w:p>
@@ -5040,7 +5411,7 @@
         <w:t xml:space="preserve"> </w:t>
       </w:r>
       <w:r>
-        <w:t xml:space="preserve">(100 points = €1.00)</w:t>
+        <w:t xml:space="preserve">(100 points = 1,00 €)</w:t>
       </w:r>
     </w:p>
     <w:p>
@@ -5059,7 +5430,7 @@
         <w:t xml:space="preserve">Price summary</w:t>
       </w:r>
       <w:r>
-        <w:t xml:space="preserve">: Service €50.00, Total €50.00</w:t>
+        <w:t xml:space="preserve">: Service 50,00 €, Total 50,00 €</w:t>
       </w:r>
     </w:p>
     <w:p>
@@ -5078,7 +5449,7 @@
         <w:t xml:space="preserve">Pay your trainer</w:t>
       </w:r>
       <w:r>
-        <w:t xml:space="preserve">: nothing is paid in the app; the customer pays €50 directly, and earns +50 XP once the trainer records the payment after the session</w:t>
+        <w:t xml:space="preserve">: nothing is paid in the app; the customer pays 50,00 € directly, and earns +50 XP once the trainer records the payment after the session</w:t>
       </w:r>
     </w:p>
     <w:p>
@@ -5163,7 +5534,7 @@
       <w:r>
         <w:drawing>
           <wp:inline>
-            <wp:extent cx="1688514" cy="7199999"/>
+            <wp:extent cx="1778340" cy="7199999"/>
             <wp:effectExtent b="0" l="0" r="0" t="0"/>
             <wp:docPr descr="Confirm booking" title="" id="1" name="Picture"/>
             <a:graphic>
@@ -5184,7 +5555,7 @@
                   <pic:spPr bwMode="auto">
                     <a:xfrm>
                       <a:off x="0" y="0"/>
-                      <a:ext cx="1688514" cy="7199999"/>
+                      <a:ext cx="1778340" cy="7199999"/>
                     </a:xfrm>
                     <a:prstGeom prst="rect">
                       <a:avLst/>
@@ -5337,6 +5708,9 @@
         </w:rPr>
         <w:t xml:space="preserve">Awaiting confirmation</w:t>
       </w:r>
+      <w:r>
+        <w:t xml:space="preserve">, with the badge under the label</w:t>
+      </w:r>
     </w:p>
     <w:p>
       <w:pPr>
@@ -5434,7 +5808,7 @@
         <w:t xml:space="preserve">PENDING</w:t>
       </w:r>
       <w:r>
-        <w:t xml:space="preserve">, total €50.00,</w:t>
+        <w:t xml:space="preserve">, total 50,00 €,</w:t>
       </w:r>
       <w:r>
         <w:t xml:space="preserve"> </w:t>
@@ -5476,7 +5850,7 @@
       <w:r>
         <w:drawing>
           <wp:inline>
-            <wp:extent cx="1566964" cy="7199999"/>
+            <wp:extent cx="1629715" cy="7199999"/>
             <wp:effectExtent b="0" l="0" r="0" t="0"/>
             <wp:docPr descr="Booking detail, awaiting confirmation" title="" id="1" name="Picture"/>
             <a:graphic>
@@ -5497,7 +5871,7 @@
                   <pic:spPr bwMode="auto">
                     <a:xfrm>
                       <a:off x="0" y="0"/>
-                      <a:ext cx="1566964" cy="7199999"/>
+                      <a:ext cx="1629715" cy="7199999"/>
                     </a:xfrm>
                     <a:prstGeom prst="rect">
                       <a:avLst/>
@@ -5733,7 +6107,7 @@
         <w:t xml:space="preserve">VFIT · CONFIRMED · Personal Training · Davide Moretti · Oct 2, 10:00 AM</w:t>
       </w:r>
       <w:r>
-        <w:t xml:space="preserve">.</w:t>
+        <w:t xml:space="preserve">, with the › chevron on the right of the card.</w:t>
       </w:r>
     </w:p>
     <w:p>
@@ -5858,7 +6232,7 @@
       <w:r>
         <w:drawing>
           <wp:inline>
-            <wp:extent cx="1616580" cy="7199999"/>
+            <wp:extent cx="1697702" cy="7199999"/>
             <wp:effectExtent b="0" l="0" r="0" t="0"/>
             <wp:docPr descr="Booking detail, confirmed" title="" id="1" name="Picture"/>
             <a:graphic>
@@ -5879,7 +6253,7 @@
                   <pic:spPr bwMode="auto">
                     <a:xfrm>
                       <a:off x="0" y="0"/>
-                      <a:ext cx="1616580" cy="7199999"/>
+                      <a:ext cx="1697702" cy="7199999"/>
                     </a:xfrm>
                     <a:prstGeom prst="rect">
                       <a:avLst/>
@@ -6226,12 +6600,366 @@
       </w:r>
     </w:p>
     <w:bookmarkEnd w:id="89"/>
-    <w:bookmarkStart w:id="90" w:name="issues-observed-during-this-walkthrough"/>
+    <w:bookmarkStart w:id="90" w:name="re-shoot-on-1-october-2026"/>
     <w:p>
       <w:pPr>
         <w:pStyle w:val="Heading2"/>
       </w:pPr>
       <w:r>
+        <w:t xml:space="preserve">Re-shoot on 1 October 2026</w:t>
+      </w:r>
+    </w:p>
+    <w:p>
+      <w:pPr>
+        <w:pStyle w:val="FirstParagraph"/>
+      </w:pPr>
+      <w:r>
+        <w:t xml:space="preserve">The issues found in this recording were fixed on 1 October 2026 (plan</w:t>
+      </w:r>
+      <w:r>
+        <w:t xml:space="preserve"> </w:t>
+      </w:r>
+      <w:r>
+        <w:rPr>
+          <w:rStyle w:val="VerbatimChar"/>
+        </w:rPr>
+        <w:t xml:space="preserve">docs/plans/2026-10-01-journey-ui-fixes-plan.md</w:t>
+      </w:r>
+      <w:r>
+        <w:t xml:space="preserve">, tasks F1–F9) and deployed to staging and production. The screens they changed were re-shot on staging, dark theme, 390 × 844:</w:t>
+      </w:r>
+    </w:p>
+    <w:p>
+      <w:pPr>
+        <w:numPr>
+          <w:ilvl w:val="0"/>
+          <w:numId w:val="1007"/>
+        </w:numPr>
+        <w:pStyle w:val="Compact"/>
+      </w:pPr>
+      <w:r>
+        <w:rPr>
+          <w:bCs/>
+          <w:b/>
+        </w:rPr>
+        <w:t xml:space="preserve">Signup</w:t>
+      </w:r>
+      <w:r>
+        <w:t xml:space="preserve"> </w:t>
+      </w:r>
+      <w:r>
+        <w:t xml:space="preserve">(A2–A4, B2–B4): the language and theme controls are a row above the</w:t>
+      </w:r>
+      <w:r>
+        <w:t xml:space="preserve"> </w:t>
+      </w:r>
+      <w:r>
+        <w:rPr>
+          <w:bCs/>
+          <w:b/>
+        </w:rPr>
+        <w:t xml:space="preserve">Back</w:t>
+      </w:r>
+      <w:r>
+        <w:t xml:space="preserve"> </w:t>
+      </w:r>
+      <w:r>
+        <w:t xml:space="preserve">/</w:t>
+      </w:r>
+      <w:r>
+        <w:t xml:space="preserve"> </w:t>
+      </w:r>
+      <w:r>
+        <w:rPr>
+          <w:bCs/>
+          <w:b/>
+        </w:rPr>
+        <w:t xml:space="preserve">Back to login</w:t>
+      </w:r>
+      <w:r>
+        <w:t xml:space="preserve"> </w:t>
+      </w:r>
+      <w:r>
+        <w:t xml:space="preserve">link instead of covering it; the terms checkbox sits right next to its text and is filled when ticked.</w:t>
+      </w:r>
+    </w:p>
+    <w:p>
+      <w:pPr>
+        <w:numPr>
+          <w:ilvl w:val="0"/>
+          <w:numId w:val="1007"/>
+        </w:numPr>
+        <w:pStyle w:val="Compact"/>
+      </w:pPr>
+      <w:r>
+        <w:rPr>
+          <w:bCs/>
+          <w:b/>
+        </w:rPr>
+        <w:t xml:space="preserve">Edit Service</w:t>
+      </w:r>
+      <w:r>
+        <w:t xml:space="preserve"> </w:t>
+      </w:r>
+      <w:r>
+        <w:t xml:space="preserve">(A9): centred on the phone, labelled fields, a real dialog that closes with Esc.</w:t>
+      </w:r>
+    </w:p>
+    <w:p>
+      <w:pPr>
+        <w:numPr>
+          <w:ilvl w:val="0"/>
+          <w:numId w:val="1007"/>
+        </w:numPr>
+        <w:pStyle w:val="Compact"/>
+      </w:pPr>
+      <w:r>
+        <w:rPr>
+          <w:bCs/>
+          <w:b/>
+        </w:rPr>
+        <w:t xml:space="preserve">Provider prices</w:t>
+      </w:r>
+      <w:r>
+        <w:t xml:space="preserve"> </w:t>
+      </w:r>
+      <w:r>
+        <w:t xml:space="preserve">(A10, A14, A15): written out in full (€50.00; 50,00 € in Italian).</w:t>
+      </w:r>
+    </w:p>
+    <w:p>
+      <w:pPr>
+        <w:numPr>
+          <w:ilvl w:val="0"/>
+          <w:numId w:val="1007"/>
+        </w:numPr>
+        <w:pStyle w:val="Compact"/>
+      </w:pPr>
+      <w:r>
+        <w:rPr>
+          <w:bCs/>
+          <w:b/>
+        </w:rPr>
+        <w:t xml:space="preserve">Location map</w:t>
+      </w:r>
+      <w:r>
+        <w:t xml:space="preserve"> </w:t>
+      </w:r>
+      <w:r>
+        <w:t xml:space="preserve">(A12): dark in the dark theme.</w:t>
+      </w:r>
+    </w:p>
+    <w:p>
+      <w:pPr>
+        <w:numPr>
+          <w:ilvl w:val="0"/>
+          <w:numId w:val="1007"/>
+        </w:numPr>
+        <w:pStyle w:val="Compact"/>
+      </w:pPr>
+      <w:r>
+        <w:rPr>
+          <w:bCs/>
+          <w:b/>
+        </w:rPr>
+        <w:t xml:space="preserve">Provider bookings</w:t>
+      </w:r>
+      <w:r>
+        <w:t xml:space="preserve"> </w:t>
+      </w:r>
+      <w:r>
+        <w:t xml:space="preserve">(A14, A15): the client avatar is a proper circle; the status badge moves under the name on a phone.</w:t>
+      </w:r>
+    </w:p>
+    <w:p>
+      <w:pPr>
+        <w:numPr>
+          <w:ilvl w:val="0"/>
+          <w:numId w:val="1007"/>
+        </w:numPr>
+        <w:pStyle w:val="Compact"/>
+      </w:pPr>
+      <w:r>
+        <w:rPr>
+          <w:bCs/>
+          <w:b/>
+        </w:rPr>
+        <w:t xml:space="preserve">Provider dashboard</w:t>
+      </w:r>
+      <w:r>
+        <w:t xml:space="preserve"> </w:t>
+      </w:r>
+      <w:r>
+        <w:t xml:space="preserve">(A16):</w:t>
+      </w:r>
+      <w:r>
+        <w:t xml:space="preserve"> </w:t>
+      </w:r>
+      <w:r>
+        <w:rPr>
+          <w:bCs/>
+          <w:b/>
+        </w:rPr>
+        <w:t xml:space="preserve">Welcome!</w:t>
+      </w:r>
+      <w:r>
+        <w:t xml:space="preserve"> </w:t>
+      </w:r>
+      <w:r>
+        <w:t xml:space="preserve">for a provider who has not delivered a session yet, and</w:t>
+      </w:r>
+      <w:r>
+        <w:t xml:space="preserve"> </w:t>
+      </w:r>
+      <w:r>
+        <w:rPr>
+          <w:iCs/>
+          <w:i/>
+        </w:rPr>
+        <w:t xml:space="preserve">Recent Activity</w:t>
+      </w:r>
+      <w:r>
+        <w:t xml:space="preserve"> </w:t>
+      </w:r>
+      <w:r>
+        <w:t xml:space="preserve">now lists the booking events.</w:t>
+      </w:r>
+    </w:p>
+    <w:p>
+      <w:pPr>
+        <w:numPr>
+          <w:ilvl w:val="0"/>
+          <w:numId w:val="1007"/>
+        </w:numPr>
+        <w:pStyle w:val="Compact"/>
+      </w:pPr>
+      <w:r>
+        <w:rPr>
+          <w:bCs/>
+          <w:b/>
+        </w:rPr>
+        <w:t xml:space="preserve">Book a service</w:t>
+      </w:r>
+      <w:r>
+        <w:t xml:space="preserve"> </w:t>
+      </w:r>
+      <w:r>
+        <w:t xml:space="preserve">(B7, B8): the</w:t>
+      </w:r>
+      <w:r>
+        <w:t xml:space="preserve"> </w:t>
+      </w:r>
+      <w:r>
+        <w:rPr>
+          <w:iCs/>
+          <w:i/>
+        </w:rPr>
+        <w:t xml:space="preserve">VERIFIED</w:t>
+      </w:r>
+      <w:r>
+        <w:t xml:space="preserve"> </w:t>
+      </w:r>
+      <w:r>
+        <w:t xml:space="preserve">badge stays whole and the distance sits next to the price.</w:t>
+      </w:r>
+    </w:p>
+    <w:p>
+      <w:pPr>
+        <w:numPr>
+          <w:ilvl w:val="0"/>
+          <w:numId w:val="1007"/>
+        </w:numPr>
+        <w:pStyle w:val="Compact"/>
+      </w:pPr>
+      <w:r>
+        <w:rPr>
+          <w:bCs/>
+          <w:b/>
+        </w:rPr>
+        <w:t xml:space="preserve">Booking calendar</w:t>
+      </w:r>
+      <w:r>
+        <w:t xml:space="preserve"> </w:t>
+      </w:r>
+      <w:r>
+        <w:t xml:space="preserve">(B10, B11): only days with at least one free slot can be picked.</w:t>
+      </w:r>
+    </w:p>
+    <w:p>
+      <w:pPr>
+        <w:numPr>
+          <w:ilvl w:val="0"/>
+          <w:numId w:val="1007"/>
+        </w:numPr>
+        <w:pStyle w:val="Compact"/>
+      </w:pPr>
+      <w:r>
+        <w:rPr>
+          <w:bCs/>
+          <w:b/>
+        </w:rPr>
+        <w:t xml:space="preserve">Booking detail</w:t>
+      </w:r>
+      <w:r>
+        <w:t xml:space="preserve"> </w:t>
+      </w:r>
+      <w:r>
+        <w:t xml:space="preserve">(B13): the</w:t>
+      </w:r>
+      <w:r>
+        <w:t xml:space="preserve"> </w:t>
+      </w:r>
+      <w:r>
+        <w:rPr>
+          <w:iCs/>
+          <w:i/>
+        </w:rPr>
+        <w:t xml:space="preserve">AWAITING CONFIRMATION</w:t>
+      </w:r>
+      <w:r>
+        <w:t xml:space="preserve"> </w:t>
+      </w:r>
+      <w:r>
+        <w:t xml:space="preserve">badge sits under the status label instead of sticking out of the card.</w:t>
+      </w:r>
+    </w:p>
+    <w:p>
+      <w:pPr>
+        <w:numPr>
+          <w:ilvl w:val="0"/>
+          <w:numId w:val="1007"/>
+        </w:numPr>
+        <w:pStyle w:val="Compact"/>
+      </w:pPr>
+      <w:r>
+        <w:rPr>
+          <w:bCs/>
+          <w:b/>
+        </w:rPr>
+        <w:t xml:space="preserve">My bookings</w:t>
+      </w:r>
+      <w:r>
+        <w:t xml:space="preserve"> </w:t>
+      </w:r>
+      <w:r>
+        <w:t xml:space="preserve">(B15): the › chevron is on the right of the card.</w:t>
+      </w:r>
+    </w:p>
+    <w:p>
+      <w:pPr>
+        <w:pStyle w:val="FirstParagraph"/>
+      </w:pPr>
+      <w:r>
+        <w:t xml:space="preserve">B12, B13a and B16 were re-taken along with them. The trainer page (B9) looked the same in the dark theme, so it was kept. A6, A7 and A8 were kept because their first-login state can’t be recreated (see the notes under them).</w:t>
+      </w:r>
+    </w:p>
+    <w:bookmarkEnd w:id="90"/>
+    <w:bookmarkStart w:id="91" w:name="issues-observed-during-this-walkthrough"/>
+    <w:p>
+      <w:pPr>
+        <w:pStyle w:val="Heading2"/>
+      </w:pPr>
+      <w:r>
         <w:t xml:space="preserve">Issues observed during this walkthrough</w:t>
       </w:r>
     </w:p>
@@ -6240,7 +6968,7 @@
         <w:pStyle w:val="FirstParagraph"/>
       </w:pPr>
       <w:r>
-        <w:t xml:space="preserve">None of these stopped the booking from going through.</w:t>
+        <w:t xml:space="preserve">None of these stopped the booking from going through. Issues 1–12 and 14 from the 30 September list are fixed (see above) and have been removed. The remaining item is kept as #1; #2–#7 were seen during the 1 October re-shoot.</w:t>
       </w:r>
     </w:p>
     <w:tbl>
@@ -6320,7 +7048,7 @@
               <w:jc w:val="left"/>
             </w:pPr>
             <w:r>
-              <w:t xml:space="preserve">Medium</w:t>
+              <w:t xml:space="preserve">Info</w:t>
             </w:r>
           </w:p>
         </w:tc>
@@ -6331,7 +7059,7 @@
               <w:jc w:val="left"/>
             </w:pPr>
             <w:r>
-              <w:t xml:space="preserve">Booking calendar (B10)</w:t>
+              <w:t xml:space="preserve">Staging</w:t>
             </w:r>
           </w:p>
         </w:tc>
@@ -6342,7 +7070,7 @@
               <w:jc w:val="left"/>
             </w:pPr>
             <w:r>
-              <w:t xml:space="preserve">Every future day is enabled, including weekends and days that the 24 h notice rules out. Picking one shows</w:t>
+              <w:t xml:space="preserve">No verification email arrives on staging (email secrets are placeholders by design), so the</w:t>
             </w:r>
             <w:r>
               <w:t xml:space="preserve"> </w:t>
@@ -6352,24 +7080,13 @@
                 <w:iCs/>
                 <w:i/>
               </w:rPr>
-              <w:t xml:space="preserve">“</w:t>
-            </w:r>
-            <w:r>
-              <w:rPr>
-                <w:iCs/>
-                <w:i/>
-              </w:rPr>
-              <w:t xml:space="preserve">No times available</w:t>
-            </w:r>
-            <w:r>
-              <w:rPr>
-                <w:iCs/>
-                <w:i/>
-              </w:rPr>
-              <w:t xml:space="preserve">”</w:t>
-            </w:r>
-            <w:r>
-              <w:t xml:space="preserve">. Days without free slots should be disabled.</w:t>
+              <w:t xml:space="preserve">Confirm your email</w:t>
+            </w:r>
+            <w:r>
+              <w:t xml:space="preserve"> </w:t>
+            </w:r>
+            <w:r>
+              <w:t xml:space="preserve">banner stays up. It does not block signup, service setup or booking.</w:t>
             </w:r>
           </w:p>
         </w:tc>
@@ -6393,7 +7110,7 @@
               <w:jc w:val="left"/>
             </w:pPr>
             <w:r>
-              <w:t xml:space="preserve">Medium</w:t>
+              <w:t xml:space="preserve">Low</w:t>
             </w:r>
           </w:p>
         </w:tc>
@@ -6404,7 +7121,7 @@
               <w:jc w:val="left"/>
             </w:pPr>
             <w:r>
-              <w:t xml:space="preserve">Signup form, terms row (A4, B4)</w:t>
+              <w:t xml:space="preserve">Customer screens (B7–B13)</w:t>
             </w:r>
           </w:p>
         </w:tc>
@@ -6415,23 +7132,56 @@
               <w:jc w:val="left"/>
             </w:pPr>
             <w:r>
-              <w:t xml:space="preserve">The checkbox wrapper takes the full width, so the</w:t>
-            </w:r>
-            <w:r>
-              <w:t xml:space="preserve"> </w:t>
+              <w:t xml:space="preserve">In English, customer-side prices still use the Italian format (</w:t>
             </w:r>
             <w:r>
               <w:rPr>
                 <w:iCs/>
                 <w:i/>
               </w:rPr>
-              <w:t xml:space="preserve">I accept the Terms…</w:t>
+              <w:t xml:space="preserve">From 50,00 €</w:t>
+            </w:r>
+            <w:r>
+              <w:t xml:space="preserve">,</w:t>
             </w:r>
             <w:r>
               <w:t xml:space="preserve"> </w:t>
             </w:r>
             <w:r>
-              <w:t xml:space="preserve">text is pushed to the right half of the box. When ticked, the box loses its fill and only a bare check mark shows.</w:t>
+              <w:rPr>
+                <w:iCs/>
+                <w:i/>
+              </w:rPr>
+              <w:t xml:space="preserve">Service 50,00 €</w:t>
+            </w:r>
+            <w:r>
+              <w:t xml:space="preserve">,</w:t>
+            </w:r>
+            <w:r>
+              <w:t xml:space="preserve"> </w:t>
+            </w:r>
+            <w:r>
+              <w:rPr>
+                <w:iCs/>
+                <w:i/>
+              </w:rPr>
+              <w:t xml:space="preserve">Value: 1,00 €</w:t>
+            </w:r>
+            <w:r>
+              <w:t xml:space="preserve">), while the provider’s screens now show</w:t>
+            </w:r>
+            <w:r>
+              <w:t xml:space="preserve"> </w:t>
+            </w:r>
+            <w:r>
+              <w:rPr>
+                <w:iCs/>
+                <w:i/>
+              </w:rPr>
+              <w:t xml:space="preserve">€50.00</w:t>
+            </w:r>
+            <w:r>
+              <w:t xml:space="preserve">.</w:t>
             </w:r>
           </w:p>
         </w:tc>
@@ -6466,7 +7216,7 @@
               <w:jc w:val="left"/>
             </w:pPr>
             <w:r>
-              <w:t xml:space="preserve">Provider bookings, Italian (A14)</w:t>
+              <w:t xml:space="preserve">Provider dashboard (A16)</w:t>
             </w:r>
           </w:p>
         </w:tc>
@@ -6477,7 +7227,17 @@
               <w:jc w:val="left"/>
             </w:pPr>
             <w:r>
-              <w:t xml:space="preserve">The price is shown as</w:t>
+              <w:rPr>
+                <w:iCs/>
+                <w:i/>
+              </w:rPr>
+              <w:t xml:space="preserve">This Month’s Earnings</w:t>
+            </w:r>
+            <w:r>
+              <w:t xml:space="preserve"> </w:t>
+            </w:r>
+            <w:r>
+              <w:t xml:space="preserve">is built by hand as</w:t>
             </w:r>
             <w:r>
               <w:t xml:space="preserve"> </w:t>
@@ -6486,22 +7246,48 @@
               <w:rPr>
                 <w:rStyle w:val="VerbatimChar"/>
               </w:rPr>
-              <w:t xml:space="preserve">€50.00</w:t>
+              <w:t xml:space="preserve">€0</w:t>
             </w:r>
             <w:r>
               <w:t xml:space="preserve"> </w:t>
             </w:r>
             <w:r>
-              <w:t xml:space="preserve">(English format) instead of</w:t>
-            </w:r>
-            <w:r>
-              <w:t xml:space="preserve"> </w:t>
+              <w:t xml:space="preserve">(</w:t>
             </w:r>
             <w:r>
               <w:rPr>
                 <w:rStyle w:val="VerbatimChar"/>
               </w:rPr>
-              <w:t xml:space="preserve">50,00 €</w:t>
+              <w:t xml:space="preserve">provider/dashboard/page.tsx</w:t>
+            </w:r>
+            <w:r>
+              <w:t xml:space="preserve">), so in Italian it reads</w:t>
+            </w:r>
+            <w:r>
+              <w:t xml:space="preserve"> </w:t>
+            </w:r>
+            <w:r>
+              <w:rPr>
+                <w:iCs/>
+                <w:i/>
+              </w:rPr>
+              <w:t xml:space="preserve">€0</w:t>
+            </w:r>
+            <w:r>
+              <w:t xml:space="preserve"> </w:t>
+            </w:r>
+            <w:r>
+              <w:t xml:space="preserve">instead of</w:t>
+            </w:r>
+            <w:r>
+              <w:t xml:space="preserve"> </w:t>
+            </w:r>
+            <w:r>
+              <w:rPr>
+                <w:iCs/>
+                <w:i/>
+              </w:rPr>
+              <w:t xml:space="preserve">0 €</w:t>
             </w:r>
             <w:r>
               <w:t xml:space="preserve">.</w:t>
@@ -6539,7 +7325,7 @@
               <w:jc w:val="left"/>
             </w:pPr>
             <w:r>
-              <w:t xml:space="preserve">Signup screens, Italian</w:t>
+              <w:t xml:space="preserve">Italian copy</w:t>
             </w:r>
           </w:p>
         </w:tc>
@@ -6550,39 +7336,46 @@
               <w:jc w:val="left"/>
             </w:pPr>
             <w:r>
-              <w:t xml:space="preserve">The</w:t>
+              <w:t xml:space="preserve">The Notifications subtitle still says</w:t>
             </w:r>
             <w:r>
               <w:t xml:space="preserve"> </w:t>
             </w:r>
             <w:r>
               <w:rPr>
-                <w:bCs/>
-                <w:b/>
+                <w:iCs/>
+                <w:i/>
               </w:rPr>
-              <w:t xml:space="preserve">Indietro</w:t>
+              <w:t xml:space="preserve">“</w:t>
+            </w:r>
+            <w:r>
+              <w:rPr>
+                <w:iCs/>
+                <w:i/>
+              </w:rPr>
+              <w:t xml:space="preserve">Centro notifiche per booking, …</w:t>
+            </w:r>
+            <w:r>
+              <w:rPr>
+                <w:iCs/>
+                <w:i/>
+              </w:rPr>
+              <w:t xml:space="preserve">”</w:t>
             </w:r>
             <w:r>
               <w:t xml:space="preserve"> </w:t>
             </w:r>
             <w:r>
-              <w:t xml:space="preserve">/</w:t>
-            </w:r>
-            <w:r>
-              <w:t xml:space="preserve"> </w:t>
+              <w:t xml:space="preserve">(</w:t>
             </w:r>
             <w:r>
               <w:rPr>
-                <w:bCs/>
-                <w:b/>
+                <w:rStyle w:val="VerbatimChar"/>
               </w:rPr>
-              <w:t xml:space="preserve">Torna al login</w:t>
-            </w:r>
-            <w:r>
-              <w:t xml:space="preserve"> </w:t>
-            </w:r>
-            <w:r>
-              <w:t xml:space="preserve">back link runs under the language picker at 390 px.</w:t>
+              <w:t xml:space="preserve">notifications.subtitle</w:t>
+            </w:r>
+            <w:r>
+              <w:t xml:space="preserve">).</w:t>
             </w:r>
           </w:p>
         </w:tc>
@@ -6617,7 +7410,7 @@
               <w:jc w:val="left"/>
             </w:pPr>
             <w:r>
-              <w:t xml:space="preserve">Booking detail (B13)</w:t>
+              <w:t xml:space="preserve">Book a service, Italian (B8)</w:t>
             </w:r>
           </w:p>
         </w:tc>
@@ -6628,23 +7421,30 @@
               <w:jc w:val="left"/>
             </w:pPr>
             <w:r>
-              <w:t xml:space="preserve">The</w:t>
-            </w:r>
-            <w:r>
-              <w:t xml:space="preserve"> </w:t>
+              <w:t xml:space="preserve">The distance uses a decimal point (</w:t>
             </w:r>
             <w:r>
               <w:rPr>
                 <w:iCs/>
                 <w:i/>
               </w:rPr>
-              <w:t xml:space="preserve">AWAITING CONFIRMATION</w:t>
+              <w:t xml:space="preserve">0.1 km</w:t>
+            </w:r>
+            <w:r>
+              <w:t xml:space="preserve">) instead of</w:t>
             </w:r>
             <w:r>
               <w:t xml:space="preserve"> </w:t>
             </w:r>
             <w:r>
-              <w:t xml:space="preserve">badge sticks out past the right edge of the status card.</w:t>
+              <w:rPr>
+                <w:iCs/>
+                <w:i/>
+              </w:rPr>
+              <w:t xml:space="preserve">0,1 km</w:t>
+            </w:r>
+            <w:r>
+              <w:t xml:space="preserve">.</w:t>
             </w:r>
           </w:p>
         </w:tc>
@@ -6679,7 +7479,7 @@
               <w:jc w:val="left"/>
             </w:pPr>
             <w:r>
-              <w:t xml:space="preserve">Provider bookings (A14)</w:t>
+              <w:t xml:space="preserve">Book a service (B8)</w:t>
             </w:r>
           </w:p>
         </w:tc>
@@ -6690,7 +7490,23 @@
               <w:jc w:val="left"/>
             </w:pPr>
             <w:r>
-              <w:t xml:space="preserve">The client avatar is squashed into a narrow oval.</w:t>
+              <w:t xml:space="preserve">Accessibility: neither the result card nor its</w:t>
+            </w:r>
+            <w:r>
+              <w:t xml:space="preserve"> </w:t>
+            </w:r>
+            <w:r>
+              <w:rPr>
+                <w:iCs/>
+                <w:i/>
+              </w:rPr>
+              <w:t xml:space="preserve">Check availability</w:t>
+            </w:r>
+            <w:r>
+              <w:t xml:space="preserve"> </w:t>
+            </w:r>
+            <w:r>
+              <w:t xml:space="preserve">text is a link or button, so a keyboard or screen-reader user cannot open a trainer from the results.</w:t>
             </w:r>
           </w:p>
         </w:tc>
@@ -6714,7 +7530,7 @@
               <w:jc w:val="left"/>
             </w:pPr>
             <w:r>
-              <w:t xml:space="preserve">Low</w:t>
+              <w:t xml:space="preserve">Info</w:t>
             </w:r>
           </w:p>
         </w:tc>
@@ -6725,7 +7541,7 @@
               <w:jc w:val="left"/>
             </w:pPr>
             <w:r>
-              <w:t xml:space="preserve">Book a service (B7, B8)</w:t>
+              <w:t xml:space="preserve">Booking detail, Cancel booking</w:t>
             </w:r>
           </w:p>
         </w:tc>
@@ -6736,7 +7552,7 @@
               <w:jc w:val="left"/>
             </w:pPr>
             <w:r>
-              <w:t xml:space="preserve">The</w:t>
+              <w:t xml:space="preserve">Accessibility: the</w:t>
             </w:r>
             <w:r>
               <w:t xml:space="preserve"> </w:t>
@@ -6746,90 +7562,29 @@
                 <w:iCs/>
                 <w:i/>
               </w:rPr>
-              <w:t xml:space="preserve">VERIFIED</w:t>
+              <w:t xml:space="preserve">Keep / Cancel</w:t>
             </w:r>
             <w:r>
               <w:t xml:space="preserve"> </w:t>
             </w:r>
             <w:r>
-              <w:t xml:space="preserve">badge is clipped at the card edge for long names. On results with a distance,</w:t>
+              <w:t xml:space="preserve">confirmation that opens from</w:t>
             </w:r>
             <w:r>
               <w:t xml:space="preserve"> </w:t>
             </w:r>
             <w:r>
-              <w:t xml:space="preserve">“</w:t>
-            </w:r>
-            <w:r>
-              <w:t xml:space="preserve">0.1 km</w:t>
-            </w:r>
-            <w:r>
-              <w:t xml:space="preserve">”</w:t>
+              <w:rPr>
+                <w:bCs/>
+                <w:b/>
+              </w:rPr>
+              <w:t xml:space="preserve">Cancel booking</w:t>
             </w:r>
             <w:r>
               <w:t xml:space="preserve"> </w:t>
             </w:r>
             <w:r>
-              <w:t xml:space="preserve">wraps between the price and</w:t>
-            </w:r>
-            <w:r>
-              <w:t xml:space="preserve"> </w:t>
-            </w:r>
-            <w:r>
-              <w:rPr>
-                <w:iCs/>
-                <w:i/>
-              </w:rPr>
-              <w:t xml:space="preserve">Check availability</w:t>
-            </w:r>
-            <w:r>
-              <w:t xml:space="preserve">.</w:t>
-            </w:r>
-          </w:p>
-        </w:tc>
-      </w:tr>
-      <w:tr>
-        <w:tc>
-          <w:p>
-            <w:pPr>
-              <w:pStyle w:val="Compact"/>
-              <w:jc w:val="left"/>
-            </w:pPr>
-            <w:r>
-              <w:t xml:space="preserve">8</w:t>
-            </w:r>
-          </w:p>
-        </w:tc>
-        <w:tc>
-          <w:p>
-            <w:pPr>
-              <w:pStyle w:val="Compact"/>
-              <w:jc w:val="left"/>
-            </w:pPr>
-            <w:r>
-              <w:t xml:space="preserve">Low</w:t>
-            </w:r>
-          </w:p>
-        </w:tc>
-        <w:tc>
-          <w:p>
-            <w:pPr>
-              <w:pStyle w:val="Compact"/>
-              <w:jc w:val="left"/>
-            </w:pPr>
-            <w:r>
-              <w:t xml:space="preserve">Edit Service dialog (A9)</w:t>
-            </w:r>
-          </w:p>
-        </w:tc>
-        <w:tc>
-          <w:p>
-            <w:pPr>
-              <w:pStyle w:val="Compact"/>
-              <w:jc w:val="left"/>
-            </w:pPr>
-            <w:r>
-              <w:t xml:space="preserve">The dialog is not centred on a phone (16 px left margin, about 48 px right). Its field labels are not linked to their inputs, and it has no</w:t>
+              <w:t xml:space="preserve">is not marked up as a dialog (no</w:t>
             </w:r>
             <w:r>
               <w:t xml:space="preserve"> </w:t>
@@ -6841,452 +7596,7 @@
               <w:t xml:space="preserve">role="dialog"</w:t>
             </w:r>
             <w:r>
-              <w:t xml:space="preserve">.</w:t>
-            </w:r>
-          </w:p>
-        </w:tc>
-      </w:tr>
-      <w:tr>
-        <w:tc>
-          <w:p>
-            <w:pPr>
-              <w:pStyle w:val="Compact"/>
-              <w:jc w:val="left"/>
-            </w:pPr>
-            <w:r>
-              <w:t xml:space="preserve">9</w:t>
-            </w:r>
-          </w:p>
-        </w:tc>
-        <w:tc>
-          <w:p>
-            <w:pPr>
-              <w:pStyle w:val="Compact"/>
-              <w:jc w:val="left"/>
-            </w:pPr>
-            <w:r>
-              <w:t xml:space="preserve">Low</w:t>
-            </w:r>
-          </w:p>
-        </w:tc>
-        <w:tc>
-          <w:p>
-            <w:pPr>
-              <w:pStyle w:val="Compact"/>
-              <w:jc w:val="left"/>
-            </w:pPr>
-            <w:r>
-              <w:t xml:space="preserve">Provider dashboard (A6, A16)</w:t>
-            </w:r>
-          </w:p>
-        </w:tc>
-        <w:tc>
-          <w:p>
-            <w:pPr>
-              <w:pStyle w:val="Compact"/>
-              <w:jc w:val="left"/>
-            </w:pPr>
-            <w:r>
-              <w:t xml:space="preserve">A brand-new provider is greeted with</w:t>
-            </w:r>
-            <w:r>
-              <w:t xml:space="preserve"> </w:t>
-            </w:r>
-            <w:r>
-              <w:rPr>
-                <w:iCs/>
-                <w:i/>
-              </w:rPr>
-              <w:t xml:space="preserve">“</w:t>
-            </w:r>
-            <w:r>
-              <w:rPr>
-                <w:iCs/>
-                <w:i/>
-              </w:rPr>
-              <w:t xml:space="preserve">Welcome back!</w:t>
-            </w:r>
-            <w:r>
-              <w:rPr>
-                <w:iCs/>
-                <w:i/>
-              </w:rPr>
-              <w:t xml:space="preserve">”</w:t>
-            </w:r>
-            <w:r>
-              <w:t xml:space="preserve">.</w:t>
-            </w:r>
-            <w:r>
-              <w:t xml:space="preserve"> </w:t>
-            </w:r>
-            <w:r>
-              <w:rPr>
-                <w:iCs/>
-                <w:i/>
-              </w:rPr>
-              <w:t xml:space="preserve">Recent Activity</w:t>
-            </w:r>
-            <w:r>
-              <w:t xml:space="preserve"> </w:t>
-            </w:r>
-            <w:r>
-              <w:t xml:space="preserve">stays empty after a booking request and a confirmation.</w:t>
-            </w:r>
-          </w:p>
-        </w:tc>
-      </w:tr>
-      <w:tr>
-        <w:tc>
-          <w:p>
-            <w:pPr>
-              <w:pStyle w:val="Compact"/>
-              <w:jc w:val="left"/>
-            </w:pPr>
-            <w:r>
-              <w:t xml:space="preserve">10</w:t>
-            </w:r>
-          </w:p>
-        </w:tc>
-        <w:tc>
-          <w:p>
-            <w:pPr>
-              <w:pStyle w:val="Compact"/>
-              <w:jc w:val="left"/>
-            </w:pPr>
-            <w:r>
-              <w:t xml:space="preserve">Low</w:t>
-            </w:r>
-          </w:p>
-        </w:tc>
-        <w:tc>
-          <w:p>
-            <w:pPr>
-              <w:pStyle w:val="Compact"/>
-              <w:jc w:val="left"/>
-            </w:pPr>
-            <w:r>
-              <w:t xml:space="preserve">My bookings (B15)</w:t>
-            </w:r>
-          </w:p>
-        </w:tc>
-        <w:tc>
-          <w:p>
-            <w:pPr>
-              <w:pStyle w:val="Compact"/>
-              <w:jc w:val="left"/>
-            </w:pPr>
-            <w:r>
-              <w:t xml:space="preserve">The card’s › chevron sits under the avatar, at the bottom-left of the card.</w:t>
-            </w:r>
-          </w:p>
-        </w:tc>
-      </w:tr>
-      <w:tr>
-        <w:tc>
-          <w:p>
-            <w:pPr>
-              <w:pStyle w:val="Compact"/>
-              <w:jc w:val="left"/>
-            </w:pPr>
-            <w:r>
-              <w:t xml:space="preserve">11</w:t>
-            </w:r>
-          </w:p>
-        </w:tc>
-        <w:tc>
-          <w:p>
-            <w:pPr>
-              <w:pStyle w:val="Compact"/>
-              <w:jc w:val="left"/>
-            </w:pPr>
-            <w:r>
-              <w:t xml:space="preserve">Low</w:t>
-            </w:r>
-          </w:p>
-        </w:tc>
-        <w:tc>
-          <w:p>
-            <w:pPr>
-              <w:pStyle w:val="Compact"/>
-              <w:jc w:val="left"/>
-            </w:pPr>
-            <w:r>
-              <w:t xml:space="preserve">Italian copy</w:t>
-            </w:r>
-          </w:p>
-        </w:tc>
-        <w:tc>
-          <w:p>
-            <w:pPr>
-              <w:pStyle w:val="Compact"/>
-              <w:jc w:val="left"/>
-            </w:pPr>
-            <w:r>
-              <w:t xml:space="preserve">The notification tag stays</w:t>
-            </w:r>
-            <w:r>
-              <w:t xml:space="preserve"> </w:t>
-            </w:r>
-            <w:r>
-              <w:rPr>
-                <w:iCs/>
-                <w:i/>
-              </w:rPr>
-              <w:t xml:space="preserve">BOOKING</w:t>
-            </w:r>
-            <w:r>
-              <w:t xml:space="preserve"> </w:t>
-            </w:r>
-            <w:r>
-              <w:t xml:space="preserve">and its description says</w:t>
-            </w:r>
-            <w:r>
-              <w:t xml:space="preserve"> </w:t>
-            </w:r>
-            <w:r>
-              <w:t xml:space="preserve">“</w:t>
-            </w:r>
-            <w:r>
-              <w:t xml:space="preserve">per booking</w:t>
-            </w:r>
-            <w:r>
-              <w:t xml:space="preserve">”</w:t>
-            </w:r>
-            <w:r>
-              <w:t xml:space="preserve">; the same action is</w:t>
-            </w:r>
-            <w:r>
-              <w:t xml:space="preserve"> </w:t>
-            </w:r>
-            <w:r>
-              <w:rPr>
-                <w:iCs/>
-                <w:i/>
-              </w:rPr>
-              <w:t xml:space="preserve">Controlla disponibilità</w:t>
-            </w:r>
-            <w:r>
-              <w:t xml:space="preserve"> </w:t>
-            </w:r>
-            <w:r>
-              <w:t xml:space="preserve">in results but</w:t>
-            </w:r>
-            <w:r>
-              <w:t xml:space="preserve"> </w:t>
-            </w:r>
-            <w:r>
-              <w:rPr>
-                <w:iCs/>
-                <w:i/>
-              </w:rPr>
-              <w:t xml:space="preserve">Verifica disponibilità</w:t>
-            </w:r>
-            <w:r>
-              <w:t xml:space="preserve"> </w:t>
-            </w:r>
-            <w:r>
-              <w:t xml:space="preserve">on the trainer page; the cancelled status is</w:t>
-            </w:r>
-            <w:r>
-              <w:t xml:space="preserve"> </w:t>
-            </w:r>
-            <w:r>
-              <w:rPr>
-                <w:iCs/>
-                <w:i/>
-              </w:rPr>
-              <w:t xml:space="preserve">Cancellate</w:t>
-            </w:r>
-            <w:r>
-              <w:t xml:space="preserve"> </w:t>
-            </w:r>
-            <w:r>
-              <w:t xml:space="preserve">in the provider portal but</w:t>
-            </w:r>
-            <w:r>
-              <w:t xml:space="preserve"> </w:t>
-            </w:r>
-            <w:r>
-              <w:rPr>
-                <w:iCs/>
-                <w:i/>
-              </w:rPr>
-              <w:t xml:space="preserve">Annullate</w:t>
-            </w:r>
-            <w:r>
-              <w:t xml:space="preserve"> </w:t>
-            </w:r>
-            <w:r>
-              <w:t xml:space="preserve">for the customer.</w:t>
-            </w:r>
-          </w:p>
-        </w:tc>
-      </w:tr>
-      <w:tr>
-        <w:tc>
-          <w:p>
-            <w:pPr>
-              <w:pStyle w:val="Compact"/>
-              <w:jc w:val="left"/>
-            </w:pPr>
-            <w:r>
-              <w:t xml:space="preserve">12</w:t>
-            </w:r>
-          </w:p>
-        </w:tc>
-        <w:tc>
-          <w:p>
-            <w:pPr>
-              <w:pStyle w:val="Compact"/>
-              <w:jc w:val="left"/>
-            </w:pPr>
-            <w:r>
-              <w:t xml:space="preserve">Info</w:t>
-            </w:r>
-          </w:p>
-        </w:tc>
-        <w:tc>
-          <w:p>
-            <w:pPr>
-              <w:pStyle w:val="Compact"/>
-              <w:jc w:val="left"/>
-            </w:pPr>
-            <w:r>
-              <w:t xml:space="preserve">Provider pages</w:t>
-            </w:r>
-          </w:p>
-        </w:tc>
-        <w:tc>
-          <w:p>
-            <w:pPr>
-              <w:pStyle w:val="Compact"/>
-              <w:jc w:val="left"/>
-            </w:pPr>
-            <w:r>
-              <w:t xml:space="preserve">The provider layout nests two</w:t>
-            </w:r>
-            <w:r>
-              <w:t xml:space="preserve"> </w:t>
-            </w:r>
-            <w:r>
-              <w:rPr>
-                <w:rStyle w:val="VerbatimChar"/>
-              </w:rPr>
-              <w:t xml:space="preserve">&lt;main&gt;</w:t>
-            </w:r>
-            <w:r>
-              <w:t xml:space="preserve"> </w:t>
-            </w:r>
-            <w:r>
-              <w:t xml:space="preserve">landmarks.</w:t>
-            </w:r>
-          </w:p>
-        </w:tc>
-      </w:tr>
-      <w:tr>
-        <w:tc>
-          <w:p>
-            <w:pPr>
-              <w:pStyle w:val="Compact"/>
-              <w:jc w:val="left"/>
-            </w:pPr>
-            <w:r>
-              <w:t xml:space="preserve">13</w:t>
-            </w:r>
-          </w:p>
-        </w:tc>
-        <w:tc>
-          <w:p>
-            <w:pPr>
-              <w:pStyle w:val="Compact"/>
-              <w:jc w:val="left"/>
-            </w:pPr>
-            <w:r>
-              <w:t xml:space="preserve">Info</w:t>
-            </w:r>
-          </w:p>
-        </w:tc>
-        <w:tc>
-          <w:p>
-            <w:pPr>
-              <w:pStyle w:val="Compact"/>
-              <w:jc w:val="left"/>
-            </w:pPr>
-            <w:r>
-              <w:t xml:space="preserve">Staging</w:t>
-            </w:r>
-          </w:p>
-        </w:tc>
-        <w:tc>
-          <w:p>
-            <w:pPr>
-              <w:pStyle w:val="Compact"/>
-              <w:jc w:val="left"/>
-            </w:pPr>
-            <w:r>
-              <w:t xml:space="preserve">No verification email arrives on staging (email secrets are placeholders by design), so the</w:t>
-            </w:r>
-            <w:r>
-              <w:t xml:space="preserve"> </w:t>
-            </w:r>
-            <w:r>
-              <w:rPr>
-                <w:iCs/>
-                <w:i/>
-              </w:rPr>
-              <w:t xml:space="preserve">Confirm your email</w:t>
-            </w:r>
-            <w:r>
-              <w:t xml:space="preserve"> </w:t>
-            </w:r>
-            <w:r>
-              <w:t xml:space="preserve">banner stays up. It does not block signup, service setup or booking.</w:t>
-            </w:r>
-          </w:p>
-        </w:tc>
-      </w:tr>
-      <w:tr>
-        <w:tc>
-          <w:p>
-            <w:pPr>
-              <w:pStyle w:val="Compact"/>
-              <w:jc w:val="left"/>
-            </w:pPr>
-            <w:r>
-              <w:t xml:space="preserve">14</w:t>
-            </w:r>
-          </w:p>
-        </w:tc>
-        <w:tc>
-          <w:p>
-            <w:pPr>
-              <w:pStyle w:val="Compact"/>
-              <w:jc w:val="left"/>
-            </w:pPr>
-            <w:r>
-              <w:t xml:space="preserve">Info</w:t>
-            </w:r>
-          </w:p>
-        </w:tc>
-        <w:tc>
-          <w:p>
-            <w:pPr>
-              <w:pStyle w:val="Compact"/>
-              <w:jc w:val="left"/>
-            </w:pPr>
-            <w:r>
-              <w:t xml:space="preserve">Location map (A12)</w:t>
-            </w:r>
-          </w:p>
-        </w:tc>
-        <w:tc>
-          <w:p>
-            <w:pPr>
-              <w:pStyle w:val="Compact"/>
-              <w:jc w:val="left"/>
-            </w:pPr>
-            <w:r>
-              <w:t xml:space="preserve">The Google map stays in its light style in dark theme.</w:t>
+              <w:t xml:space="preserve">).</w:t>
             </w:r>
           </w:p>
         </w:tc>
@@ -7299,8 +7609,8 @@
         </w:pict>
       </w:r>
     </w:p>
-    <w:bookmarkEnd w:id="90"/>
-    <w:bookmarkStart w:id="91" w:name="reproducing-this-walkthrough"/>
+    <w:bookmarkEnd w:id="91"/>
+    <w:bookmarkStart w:id="92" w:name="reproducing-this-walkthrough"/>
     <w:p>
       <w:pPr>
         <w:pStyle w:val="Heading2"/>
@@ -7313,7 +7623,7 @@
       <w:pPr>
         <w:numPr>
           <w:ilvl w:val="0"/>
-          <w:numId w:val="1007"/>
+          <w:numId w:val="1008"/>
         </w:numPr>
       </w:pPr>
       <w:r>
@@ -7364,7 +7674,7 @@
       <w:pPr>
         <w:numPr>
           <w:ilvl w:val="0"/>
-          <w:numId w:val="1007"/>
+          <w:numId w:val="1008"/>
         </w:numPr>
       </w:pPr>
       <w:r>
@@ -7426,7 +7736,7 @@
       <w:pPr>
         <w:numPr>
           <w:ilvl w:val="0"/>
-          <w:numId w:val="1007"/>
+          <w:numId w:val="1008"/>
         </w:numPr>
       </w:pPr>
       <w:r>
@@ -7458,7 +7768,7 @@
       <w:pPr>
         <w:numPr>
           <w:ilvl w:val="0"/>
-          <w:numId w:val="1007"/>
+          <w:numId w:val="1008"/>
         </w:numPr>
       </w:pPr>
       <w:r>
@@ -7469,7 +7779,7 @@
       <w:pPr>
         <w:numPr>
           <w:ilvl w:val="0"/>
-          <w:numId w:val="1007"/>
+          <w:numId w:val="1008"/>
         </w:numPr>
       </w:pPr>
       <w:r>
@@ -7566,7 +7876,7 @@
         <w:t xml:space="preserve"> en-US</w:t>
       </w:r>
     </w:p>
-    <w:bookmarkEnd w:id="91"/>
+    <w:bookmarkEnd w:id="92"/>
     <w:sectPr/>
   </w:body>
 </w:document>
@@ -7856,6 +8166,9 @@
     <w:abstractNumId w:val="991"/>
   </w:num>
   <w:num w:numId="1007">
+    <w:abstractNumId w:val="991"/>
+  </w:num>
+  <w:num w:numId="1008">
     <w:abstractNumId w:val="99411"/>
     <w:lvlOverride w:ilvl="0">
       <w:startOverride w:val="1"/>

</xml_diff>